<commit_message>
Armonizar integrantes: dejar solo el grupo nuevo de 6 en toda la documentacion
</commit_message>
<xml_diff>
--- a/salunic-defensa.docx
+++ b/salunic-defensa.docx
@@ -23,7 +23,7 @@
           <w:color w:val="0A4D2E"/>
           <w:sz w:val="36"/>
         </w:rPr>
-        <w:t>Sistema de Salud y Bienestar - Grupo 8</w:t>
+        <w:t>Sistema de Salud y Bienestar</w:t>
       </w:r>
     </w:p>
     <w:p>
@@ -53,7 +53,7 @@
         <w:rPr>
           <w:b/>
         </w:rPr>
-        <w:t>Este documento explica de forma sencilla todo el proyecto para que los 5 integrantes del grupo puedan comprenderlo y defenderlo ante el profesor.</w:t>
+        <w:t>Este documento explica de forma sencilla todo el proyecto para que los 6 integrantes del grupo puedan comprenderlo y defenderlo ante el profesor.</w:t>
       </w:r>
     </w:p>
     <w:p>
@@ -1666,7 +1666,7 @@
         <w:rPr>
           <w:b/>
         </w:rPr>
-        <w:t>Estas son las definiciones que cada uno de los 5 debe poder explicar:</w:t>
+        <w:t>Estas son las definiciones que cada uno de los 6 debe poder explicar:</w:t>
       </w:r>
     </w:p>
     <w:p>
@@ -1821,7 +1821,7 @@
         <w:rPr>
           <w:color w:val="1565C0"/>
         </w:rPr>
-        <w:t>9. Sugerencia de reparto para el grupo (5 integrantes)</w:t>
+        <w:t>9. Sugerencia de reparto para el grupo (6 integrantes)</w:t>
       </w:r>
     </w:p>
     <w:tbl>
@@ -1870,7 +1870,7 @@
           </w:tcPr>
           <w:p>
             <w:r>
-              <w:t>1 (el que mas sabe)</w:t>
+              <w:t>Cristian José Saravia Gómez</w:t>
             </w:r>
           </w:p>
         </w:tc>
@@ -1880,7 +1880,7 @@
           </w:tcPr>
           <w:p>
             <w:r>
-              <w:t>Vista general, estructura, y coherencia de todo el proyecto</w:t>
+              <w:t>Vista general, estructura y coherencia</w:t>
             </w:r>
           </w:p>
         </w:tc>
@@ -1892,7 +1892,7 @@
           </w:tcPr>
           <w:p>
             <w:r>
-              <w:t>2</w:t>
+              <w:t>Nadiezka Del Socorro Mayorga González</w:t>
             </w:r>
           </w:p>
         </w:tc>
@@ -1902,7 +1902,7 @@
           </w:tcPr>
           <w:p>
             <w:r>
-              <w:t>entidades.py: @dataclass y las 4 entidades con sus campos</w:t>
+              <w:t>entidades.py: @dataclass y las 4 entidades</w:t>
             </w:r>
           </w:p>
         </w:tc>
@@ -1914,7 +1914,7 @@
           </w:tcPr>
           <w:p>
             <w:r>
-              <w:t>3</w:t>
+              <w:t>Danny Francisco Manzanarez Morales</w:t>
             </w:r>
           </w:p>
         </w:tc>
@@ -1924,7 +1924,7 @@
           </w:tcPr>
           <w:p>
             <w:r>
-              <w:t>datos.py: las listas y los datos iniciales del inventario MINSA</w:t>
+              <w:t>datos.py: las listas y los datos iniciales</w:t>
             </w:r>
           </w:p>
         </w:tc>
@@ -1936,7 +1936,7 @@
           </w:tcPr>
           <w:p>
             <w:r>
-              <w:t>4</w:t>
+              <w:t>Luis Iván Morales Alvarado</w:t>
             </w:r>
           </w:p>
         </w:tc>
@@ -1946,7 +1946,7 @@
           </w:tcPr>
           <w:p>
             <w:r>
-              <w:t>funciones.py: validaciones y manejo de errores (try/except)</w:t>
+              <w:t>funciones.py: validaciones y manejo de errores</w:t>
             </w:r>
           </w:p>
         </w:tc>
@@ -1958,7 +1958,7 @@
           </w:tcPr>
           <w:p>
             <w:r>
-              <w:t>5</w:t>
+              <w:t>Allison Tatiana Urbina Mendez</w:t>
             </w:r>
           </w:p>
         </w:tc>
@@ -1968,7 +1968,29 @@
           </w:tcPr>
           <w:p>
             <w:r>
-              <w:t>funciones.py + main.py: operaciones CRUD y el menu</w:t>
+              <w:t>funciones.py + main.py: operaciones CRUD</w:t>
+            </w:r>
+          </w:p>
+        </w:tc>
+      </w:tr>
+      <w:tr>
+        <w:tc>
+          <w:tcPr>
+            <w:tcW w:type="dxa" w:w="4320"/>
+          </w:tcPr>
+          <w:p>
+            <w:r>
+              <w:t>María Elena Talavera Kraudys</w:t>
+            </w:r>
+          </w:p>
+        </w:tc>
+        <w:tc>
+          <w:tcPr>
+            <w:tcW w:type="dxa" w:w="4320"/>
+          </w:tcPr>
+          <w:p>
+            <w:r>
+              <w:t>main.py: el menú de dos niveles + ejecución</w:t>
             </w:r>
           </w:p>
         </w:tc>

</xml_diff>